<commit_message>
feat(contracts,catalog,ui): implementar novo motor de contrato Moura Solar, edicao de catalogo e correcoes de esteira
- Reformular motor de contratos PDF/DOCX com 14 clausulas completas e 4 anexos oficiais
- Remover testemunhas conforme diretriz comercial
- Adicionar edicao de produtos no catalogo/estoque
- Configurar parcelas e condicoes de pagamento antes do envio de contrato
- Corrigir botoes com fundo invisivel e fechamento de modais
- Atualizar evidencias visuais de M7 a M10 e documentacao
</commit_message>
<xml_diff>
--- a/apps/api/assets/contracts/template-padrao-moura-solar.docx
+++ b/apps/api/assets/contracts/template-padrao-moura-solar.docx
@@ -1607,112 +1607,6 @@
       </w:tr>
     </w:tbl>
     <w:p/>
-    <w:tbl>
-      <w:tblPr>
-        <w:tblW w:type="auto" w:w="0"/>
-        <w:jc w:val="center"/>
-        <w:tblLayout w:type="fixed"/>
-        <w:tblLook w:firstColumn="1" w:firstRow="1" w:lastColumn="0" w:lastRow="0" w:noHBand="0" w:noVBand="1" w:val="04A0"/>
-      </w:tblPr>
-      <w:tblGrid>
-        <w:gridCol w:w="4997"/>
-        <w:gridCol w:w="4997"/>
-      </w:tblGrid>
-      <w:tr>
-        <w:tc>
-          <w:tcPr>
-            <w:tcW w:type="dxa" w:w="4997"/>
-          </w:tcPr>
-          <w:p>
-            <w:pPr>
-              <w:jc w:val="center"/>
-            </w:pPr>
-            <w:r>
-              <w:br/>
-              <w:t>________________________________________</w:t>
-            </w:r>
-          </w:p>
-        </w:tc>
-        <w:tc>
-          <w:tcPr>
-            <w:tcW w:type="dxa" w:w="4997"/>
-          </w:tcPr>
-          <w:p>
-            <w:pPr>
-              <w:jc w:val="center"/>
-            </w:pPr>
-            <w:r>
-              <w:br/>
-              <w:t>________________________________________</w:t>
-            </w:r>
-          </w:p>
-        </w:tc>
-      </w:tr>
-      <w:tr>
-        <w:tc>
-          <w:tcPr>
-            <w:tcW w:type="dxa" w:w="4997"/>
-            <w:vAlign w:val="center"/>
-            <w:tcMar>
-              <w:top w:w="100" w:type="dxa"/>
-              <w:start w:w="110" w:type="dxa"/>
-              <w:bottom w:w="100" w:type="dxa"/>
-              <w:end w:w="110" w:type="dxa"/>
-            </w:tcMar>
-          </w:tcPr>
-          <w:p>
-            <w:pPr>
-              <w:jc w:val="center"/>
-            </w:pPr>
-            <w:r/>
-            <w:r>
-              <w:rPr>
-                <w:rFonts w:ascii="Aptos" w:hAnsi="Aptos"/>
-                <w:b w:val="0"/>
-                <w:color w:val="202923"/>
-                <w:sz w:val="17"/>
-              </w:rPr>
-              <w:t>TESTEMUNHA 1</w:t>
-              <w:br/>
-              <w:t>Nome {{WITNESS_1_NAME}}</w:t>
-              <w:br/>
-              <w:t>CPF {{WITNESS_1_CPF}}</w:t>
-            </w:r>
-          </w:p>
-        </w:tc>
-        <w:tc>
-          <w:tcPr>
-            <w:tcW w:type="dxa" w:w="4997"/>
-            <w:vAlign w:val="center"/>
-            <w:tcMar>
-              <w:top w:w="100" w:type="dxa"/>
-              <w:start w:w="110" w:type="dxa"/>
-              <w:bottom w:w="100" w:type="dxa"/>
-              <w:end w:w="110" w:type="dxa"/>
-            </w:tcMar>
-          </w:tcPr>
-          <w:p>
-            <w:pPr>
-              <w:jc w:val="center"/>
-            </w:pPr>
-            <w:r/>
-            <w:r>
-              <w:rPr>
-                <w:rFonts w:ascii="Aptos" w:hAnsi="Aptos"/>
-                <w:b w:val="0"/>
-                <w:color w:val="202923"/>
-                <w:sz w:val="17"/>
-              </w:rPr>
-              <w:t>TESTEMUNHA 2</w:t>
-              <w:br/>
-              <w:t>Nome {{WITNESS_2_NAME}}</w:t>
-              <w:br/>
-              <w:t>CPF {{WITNESS_2_CPF}}</w:t>
-            </w:r>
-          </w:p>
-        </w:tc>
-      </w:tr>
-    </w:tbl>
     <w:p>
       <w:pPr>
         <w:pStyle w:val="Heading1"/>

</xml_diff>